<commit_message>
feat(food-cost-guide-en): docs re-renderizados tras la revisión (95 + 32 págs.) y recuentos al día en landing, dashboard y llms
Via: Claude Code

Co-Authored-By: Claude Opus 5.5 <noreply@anthropic.com>
</commit_message>
<xml_diff>
--- a/astro-site/public/dl/food-cost-menu-engineering-guide/BONUS-solved-exercises.docx
+++ b/astro-site/public/dl/food-cost-menu-engineering-guide/BONUS-solved-exercises.docx
@@ -155,7 +155,7 @@
           <w:b w:val="0"/>
           <w:i w:val="0"/>
         </w:rPr>
-        <w:t xml:space="preserve"> - the same bottle served dine-in and sold for takeout: two tax treatments and two prices for the guest.</w:t>
+        <w:t xml:space="preserve"> - the same bottle at the table and on a delivery app: what the guest pays, what is really yours and what each channel takes off.</w:t>
       </w:r>
     </w:p>
     <w:p>
@@ -353,7 +353,7 @@
           <w:b w:val="0"/>
           <w:i w:val="0"/>
         </w:rPr>
-        <w:t>The cost of the line is not calculated on the net quantity, which is what reaches the plate, but on the gross quantity, which is what was actually bought: gross quantity times pre-tax price per unit. With 0.55 lb of gross quantity at $7.17 per lb, the tenderloin line costs $3.95 pre-tax, the figure that closes that row in the table below. If you work in kilos, as UK and Australian kitchens do, the check is the same: 0.25 kg at $15.80 per kg is $3.95.</w:t>
+        <w:t>The cost of the line is not calculated on the net quantity, which is what reaches the plate, but on the gross quantity, which is what was actually bought: gross quantity times pre-tax price per unit. With 0.55 lb of gross quantity at $7.17 per lb, the tenderloin line costs $3.95 pre-tax, the figure that closes that row in the table below. If you work in kilos, as kitchens in the UK, Canada and Australia usually do, the check is the same: 0.25 kg at 15.80 per kg is 3.95.</w:t>
       </w:r>
     </w:p>
     <w:p>
@@ -362,7 +362,7 @@
           <w:b w:val="0"/>
           <w:i w:val="0"/>
         </w:rPr>
-        <w:t>Now the error to get rid of. If you add the trim loss on top of the net quantity (0.49 lb plus 12.0% is about 0.54 lb, or 8.69 oz) and treat that as the gross quantity, the number comes out below the 0.55 lb you really need, and the line cost drops to $3.89 instead of the real $3.95: the kitchen buys too little and records a plate that costs less than it really does to produce. The difference is only six cents on this line, but it repeats on every line, every portion and every service. The sweet potato line, with 18.0% trim loss, reaches its gross quantity (0.49 lb, or 0.22 kg) the same way, and the total cost of the card, pre-tax, $5.67, is only correct if every line has been costed at gross and not at net.</w:t>
+        <w:t>Now the error to get rid of. If you add the trim loss on top of the net quantity (0.49 lb plus 12.0% is about 0.54 lb, or 8.69 oz) and treat that as the gross quantity, the number comes out below the 0.55 lb you really need, and the line cost drops to $3.89 instead of the real $3.95: the kitchen buys too little and records a plate that costs less than it really does to produce. The difference is only six cents on this line, but it repeats on every line, every portion and every service. The sweet potato line, with 18.0% trim loss, reaches its gross quantity (0.48 lb, or 0.22 kg) the same way, and the total cost of the card, pre-tax, $5.67, is only correct if every line has been costed at gross and not at net.</w:t>
       </w:r>
     </w:p>
     <w:p>
@@ -371,7 +371,7 @@
           <w:b w:val="0"/>
           <w:i w:val="0"/>
         </w:rPr>
-        <w:t>A note on tax. The prices in this exercise are pre-tax. In recipe-cost-card.xlsx the "Tax rate (%)" cell starts at 0%, and you should leave it there unless a supplier invoice really does charge you tax that you cannot recover: in that case, the tax you pay on supplies is part of the cost of the line, and you type the rate in. If you run a business in the UK, Canada or Australia and you are registered for VAT or GST/HST, the tax you pay on your purchases is recovered on your return, so it stays out of the plate cost.</w:t>
+        <w:t>A note on tax. The prices in this exercise are pre-tax. In recipe-cost-card.xlsx the "Purchase tax rate (%)" column starts at 0% on every ingredient line, and you should leave it there unless a supplier invoice really does charge you tax that you cannot recover: in that case, the tax you pay on supplies is part of the cost of the line, and you type the rate in on that line. (The separate "Tax rate (%)" cell in the summary is the tax on your menu price, not on your purchases.) If you run a business in the UK, Canada or Australia and you are registered for VAT or GST/HST, the tax you pay on your purchases is recovered on your return, so it stays out of the plate cost.</w:t>
       </w:r>
     </w:p>
     <w:p>
@@ -388,7 +388,7 @@
           <w:b w:val="0"/>
           <w:i w:val="0"/>
         </w:rPr>
-        <w:t>What separates the correct recipe cost card from the wrong one is not a theoretical nuance: it is asking the supplier for the quantity you need, or running short in the middle of service, and recording a cost that exists for real instead of one that exists only on paper. The figure that comes out of the division (0.55 lb for the tenderloin, 0.49 lb for the sweet potato) is the one that goes straight into the order; buying less leaves the line short, and ordering extra "just in case" doesn't solve the problem, it only hides it. The procedure doesn't change from one line to the next, no matter how much the trim loss or the price changes: always divide the net quantity by one minus the trim loss and multiply the result by the price. That is what holds the total cost of the card, pre-tax, at $5.67.</w:t>
+        <w:t>What separates the correct recipe cost card from the wrong one is not a theoretical nuance: it is asking the supplier for the quantity you need, or running short in the middle of service, and recording a cost that exists for real instead of one that exists only on paper. The figure that comes out of the division (0.55 lb for the tenderloin, 0.48 lb for the sweet potato) is the one that goes straight into the order; buying less leaves the line short, and ordering extra "just in case" doesn't solve the problem, it only hides it. The procedure doesn't change from one line to the next, no matter how much the trim loss or the price changes: always divide the net quantity by one minus the trim loss and multiply the result by the price. That is what holds the total cost of the card, pre-tax, at $5.67.</w:t>
       </w:r>
     </w:p>
     <w:p>
@@ -756,7 +756,7 @@
                 <w:b w:val="0"/>
                 <w:i w:val="0"/>
               </w:rPr>
-              <w:t>0.49 lb</w:t>
+              <w:t>0.48 lb</w:t>
             </w:r>
           </w:p>
         </w:tc>
@@ -818,7 +818,7 @@
                 <w:b w:val="0"/>
                 <w:i w:val="0"/>
               </w:rPr>
-              <w:t>0.02 lb</w:t>
+              <w:t>0.03 lb</w:t>
             </w:r>
           </w:p>
         </w:tc>
@@ -848,7 +848,7 @@
                 <w:b w:val="0"/>
                 <w:i w:val="0"/>
               </w:rPr>
-              <w:t>0.02 lb</w:t>
+              <w:t>0.03 lb</w:t>
             </w:r>
           </w:p>
         </w:tc>
@@ -1032,7 +1032,7 @@
                 <w:b w:val="0"/>
                 <w:i w:val="0"/>
               </w:rPr>
-              <w:t>0.11 lb</w:t>
+              <w:t>0.10 lb</w:t>
             </w:r>
           </w:p>
         </w:tc>
@@ -1278,7 +1278,7 @@
                 <w:b w:val="0"/>
                 <w:i w:val="0"/>
               </w:rPr>
-              <w:t>0.01 L</w:t>
+              <w:t>0.02 L</w:t>
             </w:r>
           </w:p>
         </w:tc>
@@ -1308,7 +1308,7 @@
                 <w:b w:val="0"/>
                 <w:i w:val="0"/>
               </w:rPr>
-              <w:t>0.01 L</w:t>
+              <w:t>0.02 L</w:t>
             </w:r>
           </w:p>
         </w:tc>
@@ -3037,7 +3037,7 @@
           <w:b w:val="0"/>
           <w:i w:val="0"/>
         </w:rPr>
-        <w:t>A month on the menu closes with four numbers you need on the table before you talk about food cost: the inventory valued at the start of the period (the beginning inventory, what was left after the physical count that closed the previous period), the purchases that came in on invoices during the month, the inventory valued at the end (the ending inventory, after that same month's count) and the net sales invoiced over those same dates, excluding sales tax and tips. None of the four replaces another: buying is not the same as consuming.</w:t>
+        <w:t>A month on the menu closes with four numbers you need on the table before you talk about food cost: the inventory valued at the start of the period (the beginning inventory, what was left after the physical count that closed the previous period), the purchases that came in on invoices during the month, the inventory valued at the end (the ending inventory, after that same month's count) and the net sales for those same dates, excluding sales tax and tips. None of the four replaces another: buying is not the same as consuming.</w:t>
       </w:r>
     </w:p>
     <w:p>
@@ -7149,7 +7149,7 @@
           <w:b w:val="0"/>
           <w:i w:val="0"/>
         </w:rPr>
-        <w:t>Third-party delivery is where the channel changes what you keep, and tax has nothing to do with it. The guest still pays $13.60 plus sales tax, but the app takes its commission off the selling price: at the 30% the simulator uses, $4.08 of the $13.60 goes to the platform and you keep $9.52, so the beverage cost on the same bottle climbs from 28.7% to 41.0% and the margin drops from $9.70 to $5.62, before you spend a cent on packaging. That's why the nine-cell tax matrix on the "Inputs" sheet of multichannel-repricing-simulator.xlsx stays at 0% for a US or Canadian menu: you type pre-tax prices and leave your sales tax out of it, because the simulator reads every price as including the rate in its cell. The UK is where tax itself moves with the channel, and where the item matters as much as the channel. Prices there are printed with 20% VAT included, so the same bottle printed at 16.32 on the premises leaves you 16.32 ÷ 1.20 = 13.60. Most cold takeaway food is zero-rated, but soft drinks, confectionery and crisps never join that zero rate: a can of cola printed at 2.76 pays 20% whether it's drunk at the table or goes out with a cold sandwich, so it nets 2.30 in both channels, while the sandwich beside it in the bag pays nothing (the detail lives in VAT Notices 709/1 and 701/14 on gov.uk). In the simulator, a UK operator types 20%, and 0% only where their cold takeaway food is zero-rated; the soft drink column never drops to zero. In Australia, the 10% GST is already inside every printed price, whatever the channel: a bottle printed at 14.96 carries 1.36 of GST (one eleventh) and nets 13.60, and that's the 10% you type in the simulator.</w:t>
+        <w:t>Third-party delivery is where the channel changes what you keep, and tax has nothing to do with it. The guest still pays $13.60 plus sales tax, but the app takes its commission off the selling price: at the 30% the simulator uses, $4.08 of the $13.60 goes to the platform and you keep $9.52, so the beverage cost on the same bottle climbs from 28.7% to 41.0% and the margin drops from $9.70 to $5.62, before you spend a cent on packaging. That's why the nine-cell tax matrix on the "Inputs" sheet of multichannel-repricing-simulator.xlsx stays at 0% for a US or Canadian menu: you type pre-tax prices, every food cost and margin in the simulator runs on them, and the cells only feed the "Price incl. tax for the guest" columns, which at 0% show the pre-tax price you print. Type your sales tax there and those columns turn into the checkout total; the margins don't move. The UK is where tax itself moves with the channel, and where the item matters as much as the channel. Prices there are printed with 20% VAT included, so the same bottle printed at 16.32 on the premises leaves you 16.32 ÷ 1.20 = 13.60. Most cold takeaway food is zero-rated, but soft drinks, confectionery and crisps never join that zero rate: a can of cola printed at 2.76 pays 20% whether it's drunk at the table or goes out with a cold sandwich, so it nets 2.30 in both channels, while the sandwich beside it in the bag pays nothing (the detail lives in VAT Notices 709/1 and 701/14 on gov.uk). In the simulator, a UK operator types 20%, and 0% only where their cold takeaway food is zero-rated; the soft drink column never drops to zero. In Australia, the 10% GST is already inside every printed price, whatever the channel: a bottle printed at 14.96 carries 1.36 of GST (one eleventh) and nets 13.60, and that's the 10% you type in the simulator.</w:t>
       </w:r>
     </w:p>
     <w:p>
@@ -10469,7 +10469,7 @@
           <w:b w:val="0"/>
           <w:i w:val="0"/>
         </w:rPr>
-        <w:t>Both paths start from the same pair of figures (food cost % and contribution margin) but cross a different second axis. Miller (1980) sets food cost % against each dish's popularity, its weight in total units sold: high or low popularity, high or low food cost, four quadrants. On this group it hands out 8 Winners (high popularity and low food cost) and 5 Losers (low popularity and high food cost), with a weighted average food cost of 26.9% across the Winners. In qualitative terms, Miller's is the first matrix model to cross food cost with the menu mix, the direct forerunner of the Kasavana and Smith matrix you've worked with throughout the rest of this pack.</w:t>
+        <w:t>Both paths start from the same pair of figures (food cost % and contribution margin) but cross a different second axis. Miller (1980) sets food cost % against each dish's popularity, its weight in total units sold: high or low popularity, high or low food cost, four quadrants. On this group it hands out 8 Winners (high popularity and low food cost) and 5 Losers (low popularity and high food cost), with a weighted average food cost of 26.9% across the Winners. Miller's is the first matrix model to cross food cost with the menu mix, the direct forerunner of the Kasavana and Smith matrix you've worked with throughout the rest of this pack.</w:t>
       </w:r>
     </w:p>
     <w:p>
@@ -10478,7 +10478,7 @@
           <w:b w:val="0"/>
           <w:i w:val="0"/>
         </w:rPr>
-        <w:t>Pavesic (1983) takes the same food cost % but changes the second axis: instead of popularity, in comes the contribution margin weighted by each dish's units sold, not the unit margin of a single portion. Swapping the individual margin for the weighted one is, in qualitative terms, the correction Pavesic makes to Miller: two dishes with the same popularity can leave different dollars in the register depending on what each unit sold is worth, a nuance that disappears if you only count portions. With that new axis the split changes: 7 Prime dishes (low food cost and high weighted margin) and 6 Problems (high food cost and low weighted margin), with a total weighted contribution margin of $21,408 across the Primes.</w:t>
+        <w:t>Pavesic (1983) takes the same food cost % but changes the second axis: instead of popularity, in comes the contribution margin weighted by each dish's units sold, not the unit margin of a single portion. Swapping the individual margin for the weighted one is the correction Pavesic makes to Miller: two dishes with the same popularity can leave different dollars in the register depending on what each unit sold is worth, a nuance that disappears if you only count portions. With that new axis the split changes: 7 Prime dishes (low food cost and high weighted margin) and 6 Problems (high food cost and low weighted margin), with a total weighted contribution margin of $21,408 across the Primes.</w:t>
       </w:r>
     </w:p>
     <w:p>
@@ -12500,7 +12500,7 @@
           <w:b w:val="0"/>
           <w:i w:val="0"/>
         </w:rPr>
-        <w:t>This exercise takes two dishes from the same menu category and applies the Hayes and Huffman (1985) index, the model the trade knows as Goal Value. Each dish brings three numbers of its own: its food cost percentage, its pre-tax menu price and the units sold in the period you are analyzing. Those three numbers, dish by dish, are what the table below collects. On top of that come two percentages that don't change from one dish to the next, because they describe the cost structure of the whole business, not of the individual recipe: labor cost as a share of sales, set at 32% for this exercise, and all other variable costs as a share of sales (utilities, maintenance, card processing fees and the like), set at 10%. These two figures go into the calculation for every dish on the menu the same way; what sets one dish apart from another is its own food cost, its own menu price and its own volume. With those five inputs (three from the dish, two from the house) the index is ready to calculate, with no outside market or competitor data needed.</w:t>
+        <w:t>This exercise takes two dishes from the same menu category, two starters (the Iberico ham croquettes and the garlic shrimp), and applies the Hayes and Huffman (1985) index, the model the trade knows as Goal Value. Each dish brings three numbers of its own: its food cost percentage, its pre-tax menu price and the units sold in the period you are analyzing. Those three numbers, dish by dish, are what the table below collects. On top of that come two percentages that don't change from one dish to the next, because they describe the cost structure of the whole business, not of the individual recipe: labor cost as a share of sales, set at 32% for this exercise, and all other variable costs as a share of sales (utilities, maintenance, card processing fees and the like), set at 10%. These two figures go into the calculation for every dish on the menu the same way; what sets one dish apart from another is its own food cost, its own menu price and its own volume. With those five inputs (three from the dish, two from the house) the index is ready to calculate, with no outside market or competitor data needed.</w:t>
       </w:r>
     </w:p>
     <w:p>
@@ -12529,7 +12529,7 @@
           <w:b w:val="0"/>
           <w:i w:val="0"/>
         </w:rPr>
-        <w:t>First, calculate the category target: the weighted average food cost of all the dishes in that category, weighting each one by its share of the group's units sold. The logic is the same one that produces the weighted average food cost of the whole menu (32.7%, according to the "Data" sheet of `menu-engineering-matrix.xlsx`), only applied to the group instead of the whole business: a dish that sells a lot weighs more in that average than one that barely leaves the kitchen, wherever its food cost happens to sit.</w:t>
+        <w:t>First, set the category target. It is the same Goal Value formula run on the category's averages instead of on one dish: average units per dish, weighted average menu price and weighted average food cost. For the starters that means 247.14 units (1,730 ÷ 7 dishes), $10.77 ($18,636 of net sales ÷ 1,730 units) and 30.71%, so the target is (1 - 0.3071) × 247.14 × 10.77 × (1 - (0.32 + 0.10 + 0.3071)) = 503.30, the figure on the "Goal Value" sheet of menu-engineering-matrix.xlsx (the sheet multiplies unrounded values, so a hand check can differ in the decimals). The weighted average food cost of the whole menu (32.7%, on the "Data" sheet) is the same idea applied to all 20 dishes, but each category gets its own target.</w:t>
       </w:r>
     </w:p>
     <w:p>
@@ -12541,7 +12541,7 @@
           <w:b w:val="0"/>
           <w:i w:val="0"/>
         </w:rPr>
-        <w:t>With the category target set, each dish adds the labor cost and the other variable costs (the 32% and 10% of the house) to its own food cost, which gives the combined weight of the three variable costs on its pre-tax menu price.</w:t>
+        <w:t>Second, run the formula on each dish: (1 - food cost %) × units sold × pre-tax menu price × (1 - (labor % + other variable costs % + food cost %)). With food cost carried to four decimals, the croquettes give (1 - 0.2442) × 420 × 8.60 × (1 - (0.32 + 0.10 + 0.2442)) = 916.77, and the garlic shrimp give (1 - 0.4452) × 260 × 15.50 × (1 - (0.32 + 0.10 + 0.4452)) = 301.50.</w:t>
       </w:r>
     </w:p>
     <w:p>
@@ -12553,7 +12553,7 @@
           <w:b w:val="0"/>
           <w:i w:val="0"/>
         </w:rPr>
-        <w:t>That combined weight is then compared against the same calculation run with the category target in place of the dish's own food cost, and the result of that comparison, adjusted for the dish's sales volume within its group, is the index: a single number that replaces the old quadrant matrix (stars, plowhorses, puzzles and dogs) with one figure you can rank, dish by dish and category by category.</w:t>
+        <w:t>Third, compare each dish with its category target: the croquettes, at 916.77, sit well above the starters' 503.30; the garlic shrimp, at 301.50, sit well below it, even though each order of shrimp leaves more dollars ($8.60 against $6.50). Food cost counts twice in the formula (once in the margin and again in the variable-cost factor), so the shrimp's 44.5% pulls the index down hard. That single number replaces the quadrant matrix (Stars, Plowhorses, Puzzles and Dogs) with one figure you can rank dish by dish inside each category.</w:t>
       </w:r>
     </w:p>
     <w:p>
@@ -12588,7 +12588,7 @@
           <w:b w:val="0"/>
           <w:i w:val="0"/>
         </w:rPr>
-        <w:t>The only thing the index tells you, dish by dish, is whether that dish sits above or below the target set by its own category. Applied to the whole menu in this exercise, the result leaves 9 dishes above their category target and 11 below, according to the "Goal Value" sheet of `menu-engineering-matrix.xlsx`. That 9-and-11 split doesn't yet tell you which category is driving the imbalance or which dish to review first. That is what the next table is for: it sets each dish against the target of its own group, so you can see, category by category, where there is margin to recover without touching the menu price and where the problem is volume, not cost.</w:t>
+        <w:t>The only thing the index tells you, dish by dish, is whether that dish sits above or below the target set by its own category. Applied to the whole menu in this exercise, the result leaves 9 dishes above their category target and 11 below, according to the "Goal Value" sheet of menu-engineering-matrix.xlsx. That 9-and-11 split doesn't yet tell you which category is driving the imbalance or which dish to review first. That is what the next table is for: it sets each dish against the target of its own group, so you can see, category by category, where there is margin to recover without touching the menu price and where the problem is volume, not cost.</w:t>
       </w:r>
     </w:p>
     <w:p>
@@ -14694,7 +14694,7 @@
           <w:b w:val="0"/>
           <w:i w:val="0"/>
         </w:rPr>
-        <w:t>The second step checks what happens if you charge the same price on delivery as in the dining room. The effective food cost is the effective cost divided by the menu price times one minus the commission, in other words, divided by what the restaurant actually keeps from the price once the platform takes its percentage. With the dine-in price untouched, the "Menu" sheet of `multichannel-repricing-simulator.xlsx` puts the croquettes' effective food cost at 46.5%, far above the channel's target food cost of 40%. That makes it plain: the dine-in price doesn't work for the delivery channel without a second look.</w:t>
+        <w:t>The second step checks what happens if you charge the same price on delivery as in the dining room. The effective food cost is the effective cost divided by the menu price times one minus the commission, in other words, divided by what the restaurant actually keeps from the price once the platform takes its percentage. With the dine-in price untouched, the "Menu" sheet of multichannel-repricing-simulator.xlsx puts the croquettes' effective food cost at 46.5%, far above the channel's target food cost of 40%. That makes it plain: the dine-in price doesn't work for the delivery channel without a second look.</w:t>
       </w:r>
     </w:p>
     <w:p>
@@ -14729,7 +14729,7 @@
           <w:b w:val="0"/>
           <w:i w:val="0"/>
         </w:rPr>
-        <w:t>The same test repeats dish by dish, and the table below sets out, as summarized in the "Summary" sheet of `multichannel-repricing-simulator.xlsx`, the result for the whole menu: 12 dishes viable on delivery against 8 you need to exclude or rework. When the required price exceeds the ceiling, the answer is not to raise the price to the limit and hope it holds: that just passes the problem to the customer, who stops ordering the dish. The real way out is to pull the dish from the delivery channel, leaving it for the dining room only, where the food cost does work, or to rework it: lower the plate cost, adjust the portion or swap an ingredient until the required price fits back under the ceiling. And repeat the calculation every time your terms with the platform change, because the commission and the costs stacked on top of it move with your area, your plan and the promotion of the moment.</w:t>
+        <w:t>The same test repeats dish by dish, and the table below sets out, as summarized in the "Summary" sheet of multichannel-repricing-simulator.xlsx, the result for the whole menu: 12 dishes viable on delivery against 8 you need to exclude or rework. When the required price exceeds the ceiling, the answer is not to raise the price to the limit and hope it holds: that just passes the problem to the customer, who stops ordering the dish. The real way out is to pull the dish from the delivery channel, leaving it for the dining room only, where the food cost does work, or to rework it: lower the plate cost, adjust the portion or swap an ingredient until the required price fits back under the ceiling. And repeat the calculation every time your terms with the platform change, because the commission and the costs stacked on top of it move with your area, your plan and the promotion of the moment.</w:t>
       </w:r>
     </w:p>
     <w:p>
@@ -17032,7 +17032,7 @@
           <w:b w:val="0"/>
           <w:i w:val="0"/>
         </w:rPr>
-        <w:t>Opening a wine by the glass is a decision you make with a calculator in hand, not on dining-room instinct. The case is the house red: a standard 750 ml bottle, sold by the glass as well as by the full bottle, with a pre-tax purchase price of $3.90. The restaurant has set one menu price for the bottle and a different one for the single glass, and the gap between what the wine costs and what you charge produces the margin and, with it, the beverage cost of each format. The figures that the "Wines" sheet of `beverage-cost-menu.xlsx` records for this wine are the following: the bottle yields 5.0 glasses (750 ml ÷ 5 = 150 ml, or 5.07 fl oz, per glass), the cost per glass is $0.78, the margin per bottle is $9.70 and the margin per glass is $2.22. The beverage cost of the whole bottle is 28.7%, that of the glass is 26.0%, and the target set for the wines on the menu is 30%. The weighted average of all the wines, using the actual sales weight of each label, comes in at 30.2%, slightly above target, but not a deviation that calls for reviewing the whole wine list.</w:t>
+        <w:t>Opening a wine by the glass is a decision you make with a calculator in hand, not on dining-room instinct. The case is the house red: a standard 750 ml bottle, sold by the glass as well as by the full bottle, with a pre-tax purchase price of $3.90. The restaurant has set one menu price for the bottle and a different one for the single glass, and the gap between what the wine costs and what you charge produces the margin and, with it, the beverage cost of each format. The figures that the "Wines" sheet of beverage-cost-menu.xlsx records for this wine are the following: the bottle yields 5.0 glasses (750 ml ÷ 5 = 150 ml, or 5.07 fl oz, per glass), the cost per glass is $0.78, the margin per bottle is $9.70 and the margin per glass is $2.22. The beverage cost of the whole bottle is 28.7%, that of the glass is 26.0%, and the target set for the wines on the menu is 30%. The weighted average of all the wines, using the actual sales weight of each label, comes in at 30.2%, slightly above target, but not a deviation that calls for reviewing the whole wine list.</w:t>
       </w:r>
     </w:p>
     <w:p>
@@ -17066,7 +17066,7 @@
           <w:b w:val="0"/>
           <w:i w:val="0"/>
         </w:rPr>
-        <w:t>The percentage improves with the glass: going from 28.7% to 26.0% beverage cost is an efficiency gain on paper. But the dollar margin per opened bottle (the $9.70 each unit supposedly generates) only materializes if all 5.0 glasses find a buyer before the wine oxidizes or comes off the list. Over-pouring, leaving a glass off the check as a comp, or dumping what is left of a bottle that has been open for several days all eat into that difference without any sheet recording it: the spreadsheet keeps showing a 26.0% beverage cost on the glass while the real bottle, the one actually opened at the bar, earns less margin than the card promises. That is why the floor's yardstick is not just to compare the glass percentage against the bottle's, but to track how many glasses of each opened bottle actually get served. As a market reference, bear in mind that it comes from a US industry aggregate with no breakdown by type of drink, and that the range in the aggregate from getbackbar.com and purimax.com (2026) puts target beverage cost at 15% to 22% for spirits and cocktails, 20% to 26% for draft beer, 24% to 28% for bottled or canned beer, and 18% to 24%, with an average of 20%, as an overall target on drink sales. The house red, at 26.0% by the glass, sits inside that same band, although the figure that rules when you set prices on your own menu is still the internal 30% target for wines, not the average of another drink category.</w:t>
+        <w:t>The percentage improves with the glass: going from 28.7% to 26.0% beverage cost is an efficiency gain on paper. But the dollar margin per opened bottle (the $9.70 each unit supposedly generates) only materializes if all 5.0 glasses find a buyer before the wine oxidizes or comes off the list. Over-pouring, leaving a glass off the check as a comp, or dumping what is left of a bottle that has been open for several days all eat into that difference without any sheet recording it: the spreadsheet keeps showing a 26.0% beverage cost on the glass while the real bottle, the one actually opened at the bar, earns less margin than the card promises. That is why the floor's yardstick is not just to compare the glass percentage against the bottle's, but to track how many glasses of each opened bottle actually get served. As a market reference, not a wine benchmark, bear in mind that the US industry aggregate from getbackbar.com and purimax.com (2026) puts target beverage cost at 15% to 22% for spirits and cocktails, 20% to 26% for draft beer, 24% to 28% for bottled or canned beer, and 18% to 24%, with an average of 20%, as an overall target on drink sales. The house red, at 26.0% by the glass, sits a little above that overall band, although the figure that rules when you set prices on your own menu is still the internal 30% target for wines, not the average of another drink category.</w:t>
       </w:r>
     </w:p>
     <w:p>
@@ -18366,7 +18366,7 @@
           <w:b w:val="0"/>
           <w:i w:val="0"/>
         </w:rPr>
-        <w:t>The month is August, with net sales of $99,600. The remaining lines (raw material consumption, gross wages, other labor costs) are already loaded in the "Monthly" sheet of `prime-cost-dashboard.xlsx`, and from them comes the full labor cost for the month, payroll taxes and benefits included: $34,517. With net sales, labor cost and the format's target as your yardstick, the exercise has everything it needs.</w:t>
+        <w:t>The month is August, with net sales of $99,600. The remaining lines (raw material consumption, gross wages, other labor costs) are already loaded in the "Monthly" sheet of prime-cost-dashboard.xlsx, and from them comes the full labor cost for the month, payroll taxes and benefits included: $34,517. With net sales, labor cost and the format's target as your yardstick, the exercise has everything it needs.</w:t>
       </w:r>
     </w:p>
     <w:p>
@@ -18418,7 +18418,7 @@
           <w:b w:val="0"/>
           <w:i w:val="0"/>
         </w:rPr>
-        <w:t>That same 69.9% would mean something different at a counter or in self-service, because that format's target is not 65% but 55%, a tougher yardstick for the same two lines. The reason is not that a counter costs less in the abstract, but that it spreads its spending differently. According to a 2026 European industry study, labor cost as a share of net sales runs 30% to 35% with integrated table service, and 15% to 25% with partial service such as self-service or a counter: the staff needed to carry the dish to the table, collect payment and clear is not the staff behind a counter where the guest does much of the legwork. Along the same lines, Toast, "How to Calculate Prime Cost" (2026), puts the expected prime cost at 60% to 65% for full service and 55% to 60% for quick service (QSR): the ceiling drops because the weight of labor drops, not because food cost has to be squeezed harder.</w:t>
+        <w:t>That same 69.9% would mean something different at a counter or in self-service, because that format's target is not 65% but 55%, a tougher yardstick for the same two lines. The reason is not that a counter costs less in the abstract, but that it spreads its spending differently. According to a 2026 European industry study, labor cost as a share of net sales runs 30% to 35% with full table service, and 15% to 25% with partial service such as self-service or a counter: the staff needed to carry the dish to the table, collect payment and clear is not the staff behind a counter where the guest does much of the legwork. Along the same lines, Toast, "How to Calculate Prime Cost" (2026), puts the expected prime cost at 60% to 65% for full service and 55% to 60% for quick service (QSR): the ceiling drops because the weight of labor drops, not because food cost has to be squeezed harder.</w:t>
       </w:r>
     </w:p>
     <w:p>
@@ -20689,7 +20689,7 @@
           <w:i/>
           <w:color w:val="444444"/>
         </w:rPr>
-        <w:t>This guide is a professional working document, not tax, legal or accounting advice. The tax rates it mentions are illustrative and sit in editable cells of the spreadsheets precisely because they change: if the rate changes, you change the cell and the whole workbook recalculates. The costs, menu prices, margins and percentages are example values taken from the eight Excel templates that come with this pack, and they are there for you to replace with your own: none of them is a forecast of your results or a pricing recommendation. How a specific transaction is classified for tax purposes, such as what counts as a restaurant service versus a sale of goods, or which rate applies to a given product, depends on the facts of that transaction. Before you change your menu, the price of a dish or the tax rate you charge, check with your accountant or tax advisor.</w:t>
+        <w:t>This guide is a professional working document, not tax, legal or accounting advice. The tax rates it mentions are illustrative and sit in editable cells of the spreadsheets precisely because they change: if the rate changes, you change the cell and the whole workbook recalculates. The costs, menu prices, margins and percentages are example values taken from the eight Excel templates that come with this pack, and they are there for you to replace with your own: none of them is a forecast of your results or a pricing recommendation. How a specific transaction is classified for tax purposes, such as whether an item counts as prepared food or as groceries, whether it is eaten on the premises or taken away, or which rate applies to a given product, depends on the facts of that transaction. Before you change your menu, the price of a dish or the tax rate you charge, check with your accountant or tax advisor.</w:t>
       </w:r>
     </w:p>
     <w:sectPr>

</xml_diff>